<commit_message>
Cleanup and added instructions
</commit_message>
<xml_diff>
--- a/Doc del proyecto.docx
+++ b/Doc del proyecto.docx
@@ -529,18 +529,8 @@
                 <w:sz w:val="20"/>
                 <w:szCs w:val="20"/>
               </w:rPr>
-              <w:t xml:space="preserve">Desarrollo de la </w:t>
-            </w:r>
-            <w:proofErr w:type="gramStart"/>
-            <w:r>
-              <w:rPr>
-                <w:rFonts w:ascii="Aptos" w:hAnsi="Aptos" w:cs="Arial"/>
-                <w:sz w:val="20"/>
-                <w:szCs w:val="20"/>
-              </w:rPr>
-              <w:t>app</w:t>
-            </w:r>
-            <w:proofErr w:type="gramEnd"/>
+              <w:t>Desarrollo de la app</w:t>
+            </w:r>
           </w:p>
         </w:tc>
       </w:tr>
@@ -3584,6 +3574,7 @@
             <w:r>
               <w:rPr>
                 <w:rFonts w:ascii="Aptos" w:hAnsi="Aptos" w:cstheme="minorHAnsi"/>
+                <w:noProof/>
                 <w:lang w:val="es-AR"/>
               </w:rPr>
               <w:drawing>
@@ -3639,23 +3630,7 @@
                 <w:rFonts w:ascii="Aptos" w:hAnsi="Aptos" w:cstheme="minorHAnsi"/>
                 <w:lang w:val="es-AR"/>
               </w:rPr>
-              <w:t xml:space="preserve">Al iniciar sesión no es requerido nada más que el nombre de usuario, si el usuario no existe se creará, si sí existe se </w:t>
-            </w:r>
-            <w:proofErr w:type="gramStart"/>
-            <w:r>
-              <w:rPr>
-                <w:rFonts w:ascii="Aptos" w:hAnsi="Aptos" w:cstheme="minorHAnsi"/>
-                <w:lang w:val="es-AR"/>
-              </w:rPr>
-              <w:t>iniciara</w:t>
-            </w:r>
-            <w:proofErr w:type="gramEnd"/>
-            <w:r>
-              <w:rPr>
-                <w:rFonts w:ascii="Aptos" w:hAnsi="Aptos" w:cstheme="minorHAnsi"/>
-                <w:lang w:val="es-AR"/>
-              </w:rPr>
-              <w:t xml:space="preserve"> sesión a ese usuario.</w:t>
+              <w:t>Al iniciar sesión no es requerido nada más que el nombre de usuario, si el usuario no existe se creará, si sí existe se iniciara sesión a ese usuario.</w:t>
             </w:r>
           </w:p>
         </w:tc>
@@ -3737,6 +3712,7 @@
             <w:r>
               <w:rPr>
                 <w:rFonts w:ascii="Aptos" w:hAnsi="Aptos" w:cstheme="minorHAnsi"/>
+                <w:noProof/>
                 <w:lang w:val="es-AR"/>
               </w:rPr>
               <w:drawing>
@@ -3792,23 +3768,7 @@
                 <w:rFonts w:ascii="Aptos" w:hAnsi="Aptos" w:cstheme="minorHAnsi"/>
                 <w:lang w:val="es-AR"/>
               </w:rPr>
-              <w:t xml:space="preserve">Se pueden crear notas dándole </w:t>
-            </w:r>
-            <w:proofErr w:type="gramStart"/>
-            <w:r>
-              <w:rPr>
-                <w:rFonts w:ascii="Aptos" w:hAnsi="Aptos" w:cstheme="minorHAnsi"/>
-                <w:lang w:val="es-AR"/>
-              </w:rPr>
-              <w:t>click</w:t>
-            </w:r>
-            <w:proofErr w:type="gramEnd"/>
-            <w:r>
-              <w:rPr>
-                <w:rFonts w:ascii="Aptos" w:hAnsi="Aptos" w:cstheme="minorHAnsi"/>
-                <w:lang w:val="es-AR"/>
-              </w:rPr>
-              <w:t xml:space="preserve"> al botón de + New note o dando doble click a algún color </w:t>
+              <w:t xml:space="preserve">Se pueden crear notas dándole click al botón de + New note o dando doble click a algún color </w:t>
             </w:r>
           </w:p>
         </w:tc>
@@ -3880,6 +3840,7 @@
             <w:r>
               <w:rPr>
                 <w:rFonts w:ascii="Aptos" w:hAnsi="Aptos" w:cstheme="minorHAnsi"/>
+                <w:noProof/>
                 <w:lang w:val="es-AR"/>
               </w:rPr>
               <w:drawing>
@@ -3989,6 +3950,7 @@
             <w:r>
               <w:rPr>
                 <w:rFonts w:ascii="Aptos" w:hAnsi="Aptos" w:cstheme="minorHAnsi"/>
+                <w:noProof/>
                 <w:lang w:val="es-AR"/>
               </w:rPr>
               <w:drawing>
@@ -4052,14 +4014,7 @@
                 <w:rFonts w:ascii="Aptos" w:hAnsi="Aptos" w:cstheme="minorHAnsi"/>
                 <w:lang w:val="es-AR"/>
               </w:rPr>
-              <w:t>RF-0</w:t>
-            </w:r>
-            <w:r>
-              <w:rPr>
-                <w:rFonts w:ascii="Aptos" w:hAnsi="Aptos" w:cstheme="minorHAnsi"/>
-                <w:lang w:val="es-AR"/>
-              </w:rPr>
-              <w:t>5</w:t>
+              <w:t>RF-05</w:t>
             </w:r>
           </w:p>
         </w:tc>
@@ -4214,6 +4169,7 @@
             <w:r>
               <w:rPr>
                 <w:rFonts w:ascii="Aptos" w:hAnsi="Aptos" w:cstheme="minorHAnsi"/>
+                <w:noProof/>
                 <w:lang w:val="es-AR"/>
               </w:rPr>
               <w:drawing>
@@ -4279,14 +4235,7 @@
                 <w:lang w:val="es-AR"/>
               </w:rPr>
               <w:lastRenderedPageBreak/>
-              <w:t>RF-0</w:t>
-            </w:r>
-            <w:r>
-              <w:rPr>
-                <w:rFonts w:ascii="Aptos" w:hAnsi="Aptos" w:cstheme="minorHAnsi"/>
-                <w:lang w:val="es-AR"/>
-              </w:rPr>
-              <w:t>6</w:t>
+              <w:t>RF-06</w:t>
             </w:r>
           </w:p>
         </w:tc>
@@ -4331,6 +4280,7 @@
             <w:r>
               <w:rPr>
                 <w:rFonts w:ascii="Aptos" w:hAnsi="Aptos" w:cstheme="minorHAnsi"/>
+                <w:noProof/>
                 <w:lang w:val="es-AR"/>
               </w:rPr>
               <w:drawing>
@@ -4417,6 +4367,7 @@
             <w:r>
               <w:rPr>
                 <w:rFonts w:ascii="Aptos" w:hAnsi="Aptos" w:cstheme="minorHAnsi"/>
+                <w:noProof/>
                 <w:lang w:val="es-AR"/>
               </w:rPr>
               <w:drawing>
@@ -4501,14 +4452,7 @@
                 <w:rFonts w:ascii="Aptos" w:hAnsi="Aptos" w:cstheme="minorHAnsi"/>
                 <w:lang w:val="es-AR"/>
               </w:rPr>
-              <w:t>RF-0</w:t>
-            </w:r>
-            <w:r>
-              <w:rPr>
-                <w:rFonts w:ascii="Aptos" w:hAnsi="Aptos" w:cstheme="minorHAnsi"/>
-                <w:lang w:val="es-AR"/>
-              </w:rPr>
-              <w:t>7</w:t>
+              <w:t>RF-07</w:t>
             </w:r>
           </w:p>
         </w:tc>
@@ -4644,6 +4588,7 @@
             <w:r>
               <w:rPr>
                 <w:rFonts w:ascii="Aptos" w:hAnsi="Aptos" w:cstheme="minorHAnsi"/>
+                <w:noProof/>
                 <w:lang w:val="es-AR"/>
               </w:rPr>
               <w:drawing>
@@ -4697,6 +4642,7 @@
             <w:r>
               <w:rPr>
                 <w:rFonts w:ascii="Aptos" w:hAnsi="Aptos" w:cstheme="minorHAnsi"/>
+                <w:noProof/>
                 <w:lang w:val="es-AR"/>
               </w:rPr>
               <w:drawing>
@@ -4874,6 +4820,7 @@
             <w:r>
               <w:rPr>
                 <w:rFonts w:ascii="Aptos" w:hAnsi="Aptos" w:cstheme="minorHAnsi"/>
+                <w:noProof/>
                 <w:lang w:val="es-AR"/>
               </w:rPr>
               <w:drawing>
@@ -5121,6 +5068,7 @@
             <w:r>
               <w:rPr>
                 <w:rFonts w:ascii="Aptos" w:hAnsi="Aptos" w:cstheme="minorHAnsi"/>
+                <w:noProof/>
                 <w:lang w:val="es-AR"/>
               </w:rPr>
               <w:drawing>
@@ -5205,6 +5153,7 @@
             <w:r>
               <w:rPr>
                 <w:rFonts w:ascii="Aptos" w:hAnsi="Aptos" w:cstheme="minorHAnsi"/>
+                <w:noProof/>
                 <w:lang w:val="es-AR"/>
               </w:rPr>
               <w:drawing>
@@ -5262,6 +5211,135 @@
               </w:rPr>
               <w:t>(el id se crea en el cliente, se puede observar que es un UUID)</w:t>
             </w:r>
+          </w:p>
+        </w:tc>
+      </w:tr>
+      <w:tr>
+        <w:trPr>
+          <w:cnfStyle w:val="000000100000" w:firstRow="0" w:lastRow="0" w:firstColumn="0" w:lastColumn="0" w:oddVBand="0" w:evenVBand="0" w:oddHBand="1" w:evenHBand="0" w:firstRowFirstColumn="0" w:firstRowLastColumn="0" w:lastRowFirstColumn="0" w:lastRowLastColumn="0"/>
+          <w:trHeight w:val="455"/>
+        </w:trPr>
+        <w:tc>
+          <w:tcPr>
+            <w:cnfStyle w:val="001000000000" w:firstRow="0" w:lastRow="0" w:firstColumn="1" w:lastColumn="0" w:oddVBand="0" w:evenVBand="0" w:oddHBand="0" w:evenHBand="0" w:firstRowFirstColumn="0" w:firstRowLastColumn="0" w:lastRowFirstColumn="0" w:lastRowLastColumn="0"/>
+            <w:tcW w:w="486" w:type="pct"/>
+          </w:tcPr>
+          <w:p>
+            <w:pPr>
+              <w:jc w:val="center"/>
+              <w:rPr>
+                <w:rFonts w:ascii="Aptos" w:hAnsi="Aptos" w:cstheme="minorHAnsi"/>
+                <w:lang w:val="es-AR"/>
+              </w:rPr>
+            </w:pPr>
+            <w:r>
+              <w:rPr>
+                <w:rFonts w:ascii="Aptos" w:hAnsi="Aptos" w:cstheme="minorHAnsi"/>
+                <w:lang w:val="es-AR"/>
+              </w:rPr>
+              <w:t>RF-12</w:t>
+            </w:r>
+          </w:p>
+        </w:tc>
+        <w:tc>
+          <w:tcPr>
+            <w:tcW w:w="903" w:type="pct"/>
+          </w:tcPr>
+          <w:p>
+            <w:pPr>
+              <w:cnfStyle w:val="000000100000" w:firstRow="0" w:lastRow="0" w:firstColumn="0" w:lastColumn="0" w:oddVBand="0" w:evenVBand="0" w:oddHBand="1" w:evenHBand="0" w:firstRowFirstColumn="0" w:firstRowLastColumn="0" w:lastRowFirstColumn="0" w:lastRowLastColumn="0"/>
+              <w:rPr>
+                <w:rFonts w:ascii="Aptos" w:hAnsi="Aptos" w:cstheme="minorHAnsi"/>
+                <w:b/>
+                <w:bCs/>
+              </w:rPr>
+            </w:pPr>
+            <w:r>
+              <w:rPr>
+                <w:rFonts w:ascii="Aptos" w:hAnsi="Aptos" w:cstheme="minorHAnsi"/>
+                <w:b/>
+                <w:bCs/>
+              </w:rPr>
+              <w:t>Redirección automática</w:t>
+            </w:r>
+          </w:p>
+        </w:tc>
+        <w:tc>
+          <w:tcPr>
+            <w:tcW w:w="3611" w:type="pct"/>
+          </w:tcPr>
+          <w:p>
+            <w:pPr>
+              <w:tabs>
+                <w:tab w:val="left" w:pos="4365"/>
+              </w:tabs>
+              <w:cnfStyle w:val="000000100000" w:firstRow="0" w:lastRow="0" w:firstColumn="0" w:lastColumn="0" w:oddVBand="0" w:evenVBand="0" w:oddHBand="1" w:evenHBand="0" w:firstRowFirstColumn="0" w:firstRowLastColumn="0" w:lastRowFirstColumn="0" w:lastRowLastColumn="0"/>
+              <w:rPr>
+                <w:rFonts w:ascii="Aptos" w:hAnsi="Aptos" w:cstheme="minorHAnsi"/>
+                <w:lang w:val="es-AR"/>
+              </w:rPr>
+            </w:pPr>
+            <w:r>
+              <w:rPr>
+                <w:rFonts w:ascii="Aptos" w:hAnsi="Aptos" w:cstheme="minorHAnsi"/>
+                <w:lang w:val="es-AR"/>
+              </w:rPr>
+              <w:t xml:space="preserve">Los usuarios que estén </w:t>
+            </w:r>
+            <w:proofErr w:type="spellStart"/>
+            <w:r>
+              <w:rPr>
+                <w:rFonts w:ascii="Aptos" w:hAnsi="Aptos" w:cstheme="minorHAnsi"/>
+                <w:lang w:val="es-AR"/>
+              </w:rPr>
+              <w:t>logeados</w:t>
+            </w:r>
+            <w:proofErr w:type="spellEnd"/>
+            <w:r>
+              <w:rPr>
+                <w:rFonts w:ascii="Aptos" w:hAnsi="Aptos" w:cstheme="minorHAnsi"/>
+                <w:lang w:val="es-AR"/>
+              </w:rPr>
+              <w:t xml:space="preserve"> no podrán acceder a la pagina /</w:t>
+            </w:r>
+            <w:proofErr w:type="spellStart"/>
+            <w:r>
+              <w:rPr>
+                <w:rFonts w:ascii="Aptos" w:hAnsi="Aptos" w:cstheme="minorHAnsi"/>
+                <w:lang w:val="es-AR"/>
+              </w:rPr>
+              <w:t>login</w:t>
+            </w:r>
+            <w:proofErr w:type="spellEnd"/>
+            <w:r>
+              <w:rPr>
+                <w:rFonts w:ascii="Aptos" w:hAnsi="Aptos" w:cstheme="minorHAnsi"/>
+                <w:lang w:val="es-AR"/>
+              </w:rPr>
+              <w:t xml:space="preserve"> porque no es necesario iniciar sesión de nuevo, por otro lado, los que no hayan iniciado sesión serán redireccionados a la página de /</w:t>
+            </w:r>
+            <w:proofErr w:type="spellStart"/>
+            <w:r>
+              <w:rPr>
+                <w:rFonts w:ascii="Aptos" w:hAnsi="Aptos" w:cstheme="minorHAnsi"/>
+                <w:lang w:val="es-AR"/>
+              </w:rPr>
+              <w:t>login</w:t>
+            </w:r>
+            <w:proofErr w:type="spellEnd"/>
+          </w:p>
+          <w:p>
+            <w:pPr>
+              <w:tabs>
+                <w:tab w:val="left" w:pos="4365"/>
+              </w:tabs>
+              <w:cnfStyle w:val="000000100000" w:firstRow="0" w:lastRow="0" w:firstColumn="0" w:lastColumn="0" w:oddVBand="0" w:evenVBand="0" w:oddHBand="1" w:evenHBand="0" w:firstRowFirstColumn="0" w:firstRowLastColumn="0" w:lastRowFirstColumn="0" w:lastRowLastColumn="0"/>
+              <w:rPr>
+                <w:rFonts w:ascii="Aptos" w:hAnsi="Aptos" w:cstheme="minorHAnsi"/>
+                <w:u w:val="single"/>
+                <w:lang w:val="es-AR"/>
+              </w:rPr>
+            </w:pPr>
           </w:p>
         </w:tc>
       </w:tr>
@@ -13288,19 +13366,10 @@
 </file>
 
 <file path=customXml/item2.xml><?xml version="1.0" encoding="utf-8"?>
-<?mso-contentType ?>
-<FormTemplates xmlns="http://schemas.microsoft.com/sharepoint/v3/contenttype/forms">
-  <Display>DocumentLibraryForm</Display>
-  <Edit>DocumentLibraryForm</Edit>
-  <New>DocumentLibraryForm</New>
-</FormTemplates>
+<b:Sources xmlns:b="http://schemas.openxmlformats.org/officeDocument/2006/bibliography" xmlns="http://schemas.openxmlformats.org/officeDocument/2006/bibliography" SelectedStyle="\APA.XSL" StyleName="APA"/>
 </file>
 
 <file path=customXml/item3.xml><?xml version="1.0" encoding="utf-8"?>
-<LongProperties xmlns="http://schemas.microsoft.com/office/2006/metadata/longProperties"/>
-</file>
-
-<file path=customXml/item4.xml><?xml version="1.0" encoding="utf-8"?>
 <ct:contentTypeSchema xmlns:ct="http://schemas.microsoft.com/office/2006/metadata/contentType" xmlns:ma="http://schemas.microsoft.com/office/2006/metadata/properties/metaAttributes" ct:_="" ma:_="" ma:contentTypeName="Documento" ma:contentTypeID="0x010100116967A1BEE64C44AED8A8640B7F6C2C" ma:contentTypeVersion="16" ma:contentTypeDescription="Crear nuevo documento." ma:contentTypeScope="" ma:versionID="fb4fed8443ef039b92fc8d171e3e4341">
   <xsd:schema xmlns:xsd="http://www.w3.org/2001/XMLSchema" xmlns:xs="http://www.w3.org/2001/XMLSchema" xmlns:p="http://schemas.microsoft.com/office/2006/metadata/properties" xmlns:ns2="72017657-c30a-403c-bda6-c51ec90d85a7" xmlns:ns3="2ed7734e-17e8-4cb5-9a9c-82f1b44e108d" targetNamespace="http://schemas.microsoft.com/office/2006/metadata/properties" ma:root="true" ma:fieldsID="08f621cf226f69412745df55542e2e82" ns2:_="" ns3:_="">
     <xsd:import namespace="72017657-c30a-403c-bda6-c51ec90d85a7"/>
@@ -13529,8 +13598,17 @@
 </ct:contentTypeSchema>
 </file>
 
+<file path=customXml/item4.xml><?xml version="1.0" encoding="utf-8"?>
+<LongProperties xmlns="http://schemas.microsoft.com/office/2006/metadata/longProperties"/>
+</file>
+
 <file path=customXml/item5.xml><?xml version="1.0" encoding="utf-8"?>
-<b:Sources xmlns:b="http://schemas.openxmlformats.org/officeDocument/2006/bibliography" xmlns="http://schemas.openxmlformats.org/officeDocument/2006/bibliography" SelectedStyle="\APA.XSL" StyleName="APA"/>
+<?mso-contentType ?>
+<FormTemplates xmlns="http://schemas.microsoft.com/sharepoint/v3/contenttype/forms">
+  <Display>DocumentLibraryForm</Display>
+  <Edit>DocumentLibraryForm</Edit>
+  <New>DocumentLibraryForm</New>
+</FormTemplates>
 </file>
 
 <file path=customXml/itemProps1.xml><?xml version="1.0" encoding="utf-8"?>
@@ -13545,22 +13623,14 @@
 </file>
 
 <file path=customXml/itemProps2.xml><?xml version="1.0" encoding="utf-8"?>
-<ds:datastoreItem xmlns:ds="http://schemas.openxmlformats.org/officeDocument/2006/customXml" ds:itemID="{7E19B87D-53B8-42BB-A6A7-BD83797E42B1}">
+<ds:datastoreItem xmlns:ds="http://schemas.openxmlformats.org/officeDocument/2006/customXml" ds:itemID="{C77C6ADC-4F29-4A06-B8D4-84A7C3BBA4CE}">
   <ds:schemaRefs>
-    <ds:schemaRef ds:uri="http://schemas.microsoft.com/sharepoint/v3/contenttype/forms"/>
+    <ds:schemaRef ds:uri="http://schemas.openxmlformats.org/officeDocument/2006/bibliography"/>
   </ds:schemaRefs>
 </ds:datastoreItem>
 </file>
 
 <file path=customXml/itemProps3.xml><?xml version="1.0" encoding="utf-8"?>
-<ds:datastoreItem xmlns:ds="http://schemas.openxmlformats.org/officeDocument/2006/customXml" ds:itemID="{88011E9B-8BC2-4A4B-93DB-40C0D432F180}">
-  <ds:schemaRefs>
-    <ds:schemaRef ds:uri="http://schemas.microsoft.com/office/2006/metadata/longProperties"/>
-  </ds:schemaRefs>
-</ds:datastoreItem>
-</file>
-
-<file path=customXml/itemProps4.xml><?xml version="1.0" encoding="utf-8"?>
 <ds:datastoreItem xmlns:ds="http://schemas.openxmlformats.org/officeDocument/2006/customXml" ds:itemID="{F2403F4E-A641-4439-A2A1-3A76548F8F3D}">
   <ds:schemaRefs>
     <ds:schemaRef ds:uri="http://schemas.microsoft.com/office/2006/metadata/contentType"/>
@@ -13579,10 +13649,18 @@
 </ds:datastoreItem>
 </file>
 
+<file path=customXml/itemProps4.xml><?xml version="1.0" encoding="utf-8"?>
+<ds:datastoreItem xmlns:ds="http://schemas.openxmlformats.org/officeDocument/2006/customXml" ds:itemID="{88011E9B-8BC2-4A4B-93DB-40C0D432F180}">
+  <ds:schemaRefs>
+    <ds:schemaRef ds:uri="http://schemas.microsoft.com/office/2006/metadata/longProperties"/>
+  </ds:schemaRefs>
+</ds:datastoreItem>
+</file>
+
 <file path=customXml/itemProps5.xml><?xml version="1.0" encoding="utf-8"?>
-<ds:datastoreItem xmlns:ds="http://schemas.openxmlformats.org/officeDocument/2006/customXml" ds:itemID="{C77C6ADC-4F29-4A06-B8D4-84A7C3BBA4CE}">
+<ds:datastoreItem xmlns:ds="http://schemas.openxmlformats.org/officeDocument/2006/customXml" ds:itemID="{7E19B87D-53B8-42BB-A6A7-BD83797E42B1}">
   <ds:schemaRefs>
-    <ds:schemaRef ds:uri="http://schemas.openxmlformats.org/officeDocument/2006/bibliography"/>
+    <ds:schemaRef ds:uri="http://schemas.microsoft.com/sharepoint/v3/contenttype/forms"/>
   </ds:schemaRefs>
 </ds:datastoreItem>
 </file>
</xml_diff>